<commit_message>
layout change to table, works better
</commit_message>
<xml_diff>
--- a/certificate_template.docx
+++ b/certificate_template.docx
@@ -4,379 +4,480 @@
   <w:body>
     <w:p>
       <w:pPr>
-        <w:pStyle w:val="6"/>
-        <w:keepNext w:val="0"/>
-        <w:keepLines w:val="0"/>
-        <w:widowControl/>
-        <w:suppressLineNumbers w:val="0"/>
-        <w:spacing w:line="14" w:lineRule="atLeast"/>
-        <w:jc w:val="left"/>
         <w:rPr>
-          <w:rFonts w:hint="default"/>
-          <w:lang w:val="en-PH"/>
+          <w:rFonts w:hint="default" w:ascii="Arial Narrow" w:hAnsi="Arial Narrow" w:cs="Arial Narrow"/>
+          <w:sz w:val="24"/>
+          <w:szCs w:val="24"/>
+          <w:lang w:val="en-US"/>
         </w:rPr>
       </w:pPr>
+      <w:bookmarkStart w:id="0" w:name="_GoBack"/>
+      <w:bookmarkEnd w:id="0"/>
       <w:r>
         <w:rPr>
-          <w:rFonts w:hint="default"/>
+          <w:rFonts w:hint="default" w:ascii="Arial Narrow" w:hAnsi="Arial Narrow" w:cs="Arial Narrow"/>
+          <w:sz w:val="24"/>
+          <w:szCs w:val="24"/>
           <w:lang w:val="en-PH"/>
         </w:rPr>
         <w:t>{% for person in people %}</w:t>
       </w:r>
     </w:p>
-    <w:p>
-      <w:pPr>
-        <w:pStyle w:val="6"/>
-        <w:keepNext w:val="0"/>
-        <w:keepLines w:val="0"/>
-        <w:widowControl/>
-        <w:suppressLineNumbers w:val="0"/>
-        <w:spacing w:line="14" w:lineRule="atLeast"/>
-        <w:jc w:val="left"/>
-        <w:rPr>
-          <w:rFonts w:hint="default"/>
-          <w:lang w:val="en-PH"/>
-        </w:rPr>
-      </w:pPr>
-    </w:p>
-    <w:p>
-      <w:pPr>
-        <w:pStyle w:val="6"/>
-        <w:keepNext w:val="0"/>
-        <w:keepLines w:val="0"/>
-        <w:widowControl/>
-        <w:suppressLineNumbers w:val="0"/>
-        <w:spacing w:line="14" w:lineRule="atLeast"/>
-        <w:jc w:val="left"/>
-        <w:rPr>
-          <w:rFonts w:hint="default"/>
-          <w:lang w:val="en-PH"/>
-        </w:rPr>
-      </w:pPr>
-    </w:p>
-    <w:p>
-      <w:pPr>
-        <w:pStyle w:val="6"/>
-        <w:keepNext w:val="0"/>
-        <w:keepLines w:val="0"/>
-        <w:widowControl/>
-        <w:suppressLineNumbers w:val="0"/>
-        <w:spacing w:line="14" w:lineRule="atLeast"/>
-        <w:jc w:val="left"/>
-        <w:rPr>
-          <w:rFonts w:hint="default"/>
-          <w:lang w:val="en-PH"/>
-        </w:rPr>
-      </w:pPr>
-    </w:p>
-    <w:p>
-      <w:pPr>
-        <w:pStyle w:val="6"/>
-        <w:keepNext w:val="0"/>
-        <w:keepLines w:val="0"/>
-        <w:widowControl/>
-        <w:suppressLineNumbers w:val="0"/>
-        <w:spacing w:line="14" w:lineRule="atLeast"/>
-        <w:jc w:val="left"/>
-        <w:rPr>
-          <w:rFonts w:hint="default"/>
-          <w:lang w:val="en-PH"/>
-        </w:rPr>
-      </w:pPr>
-    </w:p>
-    <w:p>
-      <w:pPr>
-        <w:pStyle w:val="6"/>
-        <w:keepNext w:val="0"/>
-        <w:keepLines w:val="0"/>
-        <w:widowControl/>
-        <w:suppressLineNumbers w:val="0"/>
-        <w:spacing w:line="14" w:lineRule="atLeast"/>
-        <w:jc w:val="left"/>
-        <w:rPr>
-          <w:rFonts w:hint="default"/>
-          <w:lang w:val="en-PH"/>
-        </w:rPr>
-      </w:pPr>
-    </w:p>
-    <w:p>
-      <w:pPr>
-        <w:pStyle w:val="6"/>
-        <w:keepNext w:val="0"/>
-        <w:keepLines w:val="0"/>
-        <w:widowControl/>
-        <w:suppressLineNumbers w:val="0"/>
-        <w:spacing w:line="14" w:lineRule="atLeast"/>
-        <w:jc w:val="left"/>
-        <w:rPr>
-          <w:rFonts w:hint="default"/>
-          <w:lang w:val="en-PH"/>
-        </w:rPr>
-      </w:pPr>
-    </w:p>
-    <w:p>
-      <w:pPr>
-        <w:pStyle w:val="6"/>
-        <w:keepNext w:val="0"/>
-        <w:keepLines w:val="0"/>
-        <w:widowControl/>
-        <w:suppressLineNumbers w:val="0"/>
-        <w:spacing w:line="14" w:lineRule="atLeast"/>
-        <w:jc w:val="left"/>
-        <w:rPr>
-          <w:rFonts w:hint="default"/>
-          <w:lang w:val="en-PH"/>
-        </w:rPr>
-      </w:pPr>
-    </w:p>
-    <w:p>
-      <w:pPr>
-        <w:pStyle w:val="6"/>
-        <w:keepNext w:val="0"/>
-        <w:keepLines w:val="0"/>
-        <w:widowControl/>
-        <w:suppressLineNumbers w:val="0"/>
-        <w:spacing w:line="14" w:lineRule="atLeast"/>
-        <w:jc w:val="left"/>
-        <w:rPr>
-          <w:rFonts w:hint="default"/>
-          <w:lang w:val="en-PH"/>
-        </w:rPr>
-      </w:pPr>
-      <w:r>
-        <w:rPr>
-          <w:rFonts w:hint="default" w:ascii="Old English Text MT" w:hAnsi="Old English Text MT" w:cs="Old English Text MT"/>
-          <w:color w:val="FFFFFF" w:themeColor="background1"/>
-          <w:sz w:val="94"/>
-          <w:szCs w:val="94"/>
-          <w:lang w:val="en-PH"/>
-          <w14:textFill>
-            <w14:solidFill>
-              <w14:schemeClr w14:val="bg1"/>
-            </w14:solidFill>
-          </w14:textFill>
-        </w:rPr>
-        <w:t>{{person.name}}</w:t>
-      </w:r>
-      <w:r>
-        <w:rPr>
-          <w:rFonts w:hint="default" w:ascii="Old English Text MT" w:hAnsi="Old English Text MT" w:cs="Old English Text MT"/>
-          <w:color w:val="FFFFFF" w:themeColor="background1"/>
-          <w:sz w:val="84"/>
-          <w:szCs w:val="84"/>
-          <w:lang w:val="en-PH"/>
-          <w14:textFill>
-            <w14:solidFill>
-              <w14:schemeClr w14:val="bg1"/>
-            </w14:solidFill>
-          </w14:textFill>
-        </w:rPr>
-        <w:br w:type="textWrapping"/>
-      </w:r>
-    </w:p>
-    <w:p>
-      <w:pPr>
-        <w:pStyle w:val="6"/>
-        <w:keepNext w:val="0"/>
-        <w:keepLines w:val="0"/>
-        <w:widowControl/>
-        <w:suppressLineNumbers w:val="0"/>
-        <w:spacing w:line="14" w:lineRule="atLeast"/>
-        <w:jc w:val="left"/>
-        <w:rPr>
-          <w:rFonts w:hint="default" w:ascii="Arial Narrow" w:hAnsi="Arial Narrow" w:cs="Arial Narrow"/>
-          <w:sz w:val="32"/>
-          <w:szCs w:val="32"/>
-          <w:lang w:val="en-PH"/>
-        </w:rPr>
-      </w:pPr>
-      <w:r>
-        <w:rPr>
-          <w:rFonts w:hint="default" w:ascii="Arial Narrow" w:hAnsi="Arial Narrow" w:cs="Arial Narrow"/>
-          <w:sz w:val="32"/>
-          <w:szCs w:val="32"/>
-          <w:lang w:val="en-PH"/>
-        </w:rPr>
-        <w:t xml:space="preserve">This certificate is awarded to Mr. {{person.name}} for his remarkable performance for </w:t>
-      </w:r>
-    </w:p>
-    <w:p>
-      <w:pPr>
-        <w:pStyle w:val="6"/>
-        <w:keepNext w:val="0"/>
-        <w:keepLines w:val="0"/>
-        <w:widowControl/>
-        <w:suppressLineNumbers w:val="0"/>
-        <w:spacing w:line="14" w:lineRule="atLeast"/>
-        <w:jc w:val="left"/>
-        <w:rPr>
-          <w:rFonts w:hint="default" w:ascii="Arial Narrow" w:hAnsi="Arial Narrow" w:cs="Arial Narrow"/>
-          <w:sz w:val="32"/>
-          <w:szCs w:val="32"/>
-          <w:lang w:val="en-PH"/>
-        </w:rPr>
-      </w:pPr>
-      <w:r>
-        <w:rPr>
-          <w:rFonts w:hint="default" w:ascii="Arial Narrow" w:hAnsi="Arial Narrow" w:cs="Arial Narrow"/>
-          <w:sz w:val="32"/>
-          <w:szCs w:val="32"/>
-          <w:lang w:val="en-PH"/>
-        </w:rPr>
-        <w:tab/>
-      </w:r>
-      <w:r>
-        <w:rPr>
-          <w:rFonts w:hint="default" w:ascii="Arial Narrow" w:hAnsi="Arial Narrow" w:cs="Arial Narrow"/>
-          <w:sz w:val="32"/>
-          <w:szCs w:val="32"/>
-          <w:lang w:val="en-PH"/>
-        </w:rPr>
-        <w:tab/>
-      </w:r>
-      <w:r>
-        <w:rPr>
-          <w:rFonts w:hint="default" w:ascii="Arial Narrow" w:hAnsi="Arial Narrow" w:cs="Arial Narrow"/>
-          <w:sz w:val="32"/>
-          <w:szCs w:val="32"/>
-          <w:lang w:val="en-PH"/>
-        </w:rPr>
-        <w:tab/>
-      </w:r>
-      <w:r>
-        <w:rPr>
-          <w:rFonts w:hint="default" w:ascii="Arial Narrow" w:hAnsi="Arial Narrow" w:cs="Arial Narrow"/>
-          <w:sz w:val="32"/>
-          <w:szCs w:val="32"/>
-          <w:lang w:val="en-PH"/>
-        </w:rPr>
-        <w:t>Sangguniang Kabataan basketball team</w:t>
-      </w:r>
-    </w:p>
-    <w:p>
-      <w:pPr>
-        <w:pStyle w:val="6"/>
-        <w:keepNext w:val="0"/>
-        <w:keepLines w:val="0"/>
-        <w:widowControl/>
-        <w:suppressLineNumbers w:val="0"/>
-        <w:spacing w:line="14" w:lineRule="atLeast"/>
-        <w:jc w:val="left"/>
-        <w:rPr>
-          <w:rFonts w:hint="default" w:ascii="Arial Narrow" w:hAnsi="Arial Narrow" w:cs="Arial Narrow"/>
-          <w:sz w:val="44"/>
-          <w:szCs w:val="44"/>
-          <w:lang w:val="en-US"/>
-        </w:rPr>
-      </w:pPr>
-    </w:p>
-    <w:p>
-      <w:pPr>
-        <w:pStyle w:val="6"/>
-        <w:keepNext w:val="0"/>
-        <w:keepLines w:val="0"/>
-        <w:widowControl/>
-        <w:suppressLineNumbers w:val="0"/>
-        <w:spacing w:line="14" w:lineRule="atLeast"/>
-        <w:ind w:firstLine="1652" w:firstLineChars="459"/>
-        <w:jc w:val="left"/>
-        <w:rPr>
-          <w:rFonts w:hint="default" w:ascii="Arial Narrow" w:hAnsi="Arial Narrow" w:cs="Arial Narrow"/>
-          <w:sz w:val="36"/>
-          <w:szCs w:val="36"/>
-          <w:lang w:val="en-PH"/>
-        </w:rPr>
-      </w:pPr>
-      <w:r>
-        <w:rPr>
-          <w:rFonts w:hint="default" w:ascii="Arial Narrow" w:hAnsi="Arial Narrow" w:cs="Arial Narrow"/>
-          <w:sz w:val="36"/>
-          <w:szCs w:val="36"/>
-          <w:lang w:val="en-PH"/>
-        </w:rPr>
-        <w:t>{{person.director}}</w:t>
-      </w:r>
-      <w:r>
-        <w:rPr>
-          <w:rFonts w:hint="default" w:ascii="Arial Narrow" w:hAnsi="Arial Narrow" w:cs="Arial Narrow"/>
-          <w:sz w:val="36"/>
-          <w:szCs w:val="36"/>
-          <w:lang w:val="en-US"/>
-        </w:rPr>
-        <w:tab/>
-      </w:r>
-      <w:r>
-        <w:rPr>
-          <w:rFonts w:hint="default" w:ascii="Arial Narrow" w:hAnsi="Arial Narrow" w:cs="Arial Narrow"/>
-          <w:sz w:val="36"/>
-          <w:szCs w:val="36"/>
-          <w:lang w:val="en-US"/>
-        </w:rPr>
-        <w:tab/>
-      </w:r>
-      <w:r>
-        <w:rPr>
-          <w:rFonts w:hint="default" w:ascii="Arial Narrow" w:hAnsi="Arial Narrow" w:cs="Arial Narrow"/>
-          <w:sz w:val="36"/>
-          <w:szCs w:val="36"/>
-          <w:lang w:val="en-US"/>
-        </w:rPr>
-        <w:tab/>
-      </w:r>
-      <w:r>
-        <w:rPr>
-          <w:rFonts w:hint="default" w:ascii="Arial Narrow" w:hAnsi="Arial Narrow" w:cs="Arial Narrow"/>
-          <w:sz w:val="36"/>
-          <w:szCs w:val="36"/>
-          <w:lang w:val="en-US"/>
-        </w:rPr>
-        <w:tab/>
-      </w:r>
-      <w:r>
-        <w:rPr>
-          <w:rFonts w:hint="default" w:ascii="Arial Narrow" w:hAnsi="Arial Narrow" w:cs="Arial Narrow"/>
-          <w:sz w:val="36"/>
-          <w:szCs w:val="36"/>
-          <w:lang w:val="en-US"/>
-        </w:rPr>
-        <w:tab/>
-      </w:r>
-      <w:r>
-        <w:rPr>
-          <w:rFonts w:hint="default" w:ascii="Arial Narrow" w:hAnsi="Arial Narrow" w:cs="Arial Narrow"/>
-          <w:sz w:val="36"/>
-          <w:szCs w:val="36"/>
-          <w:lang w:val="en-US"/>
-        </w:rPr>
-        <w:t xml:space="preserve">    </w:t>
-      </w:r>
-      <w:bookmarkStart w:id="0" w:name="_GoBack"/>
-      <w:bookmarkEnd w:id="0"/>
-      <w:r>
-        <w:rPr>
-          <w:rFonts w:hint="default" w:ascii="Arial Narrow" w:hAnsi="Arial Narrow" w:cs="Arial Narrow"/>
-          <w:sz w:val="36"/>
-          <w:szCs w:val="36"/>
-          <w:lang w:val="en-PH"/>
-        </w:rPr>
-        <w:t xml:space="preserve">{{person.coach}}   </w:t>
-      </w:r>
-    </w:p>
-    <w:p>
-      <w:pPr>
-        <w:rPr>
-          <w:rFonts w:hint="default"/>
-          <w:lang w:val="en-PH"/>
-        </w:rPr>
-      </w:pPr>
-      <w:r>
-        <w:rPr>
-          <w:rFonts w:hint="default"/>
-          <w:lang w:val="en-PH"/>
-        </w:rPr>
-        <w:br w:type="page"/>
-      </w:r>
-    </w:p>
+    <w:tbl>
+      <w:tblPr>
+        <w:tblStyle w:val="7"/>
+        <w:tblW w:w="0" w:type="auto"/>
+        <w:tblInd w:w="0" w:type="dxa"/>
+        <w:tblBorders>
+          <w:top w:val="none" w:color="auto" w:sz="0" w:space="0"/>
+          <w:left w:val="none" w:color="auto" w:sz="0" w:space="0"/>
+          <w:bottom w:val="none" w:color="auto" w:sz="0" w:space="0"/>
+          <w:right w:val="none" w:color="auto" w:sz="0" w:space="0"/>
+          <w:insideH w:val="none" w:color="auto" w:sz="0" w:space="0"/>
+          <w:insideV w:val="none" w:color="auto" w:sz="0" w:space="0"/>
+        </w:tblBorders>
+        <w:tblLayout w:type="autofit"/>
+        <w:tblCellMar>
+          <w:top w:w="0" w:type="dxa"/>
+          <w:left w:w="108" w:type="dxa"/>
+          <w:bottom w:w="0" w:type="dxa"/>
+          <w:right w:w="108" w:type="dxa"/>
+        </w:tblCellMar>
+      </w:tblPr>
+      <w:tblGrid>
+        <w:gridCol w:w="7662"/>
+        <w:gridCol w:w="4766"/>
+        <w:gridCol w:w="3186"/>
+      </w:tblGrid>
+      <w:tr>
+        <w:tblPrEx>
+          <w:tblBorders>
+            <w:top w:val="none" w:color="auto" w:sz="0" w:space="0"/>
+            <w:left w:val="none" w:color="auto" w:sz="0" w:space="0"/>
+            <w:bottom w:val="none" w:color="auto" w:sz="0" w:space="0"/>
+            <w:right w:val="none" w:color="auto" w:sz="0" w:space="0"/>
+            <w:insideH w:val="none" w:color="auto" w:sz="0" w:space="0"/>
+            <w:insideV w:val="none" w:color="auto" w:sz="0" w:space="0"/>
+          </w:tblBorders>
+          <w:tblCellMar>
+            <w:top w:w="0" w:type="dxa"/>
+            <w:left w:w="108" w:type="dxa"/>
+            <w:bottom w:w="0" w:type="dxa"/>
+            <w:right w:w="108" w:type="dxa"/>
+          </w:tblCellMar>
+        </w:tblPrEx>
+        <w:tc>
+          <w:tcPr>
+            <w:tcW w:w="15614" w:type="dxa"/>
+            <w:gridSpan w:val="3"/>
+          </w:tcPr>
+          <w:p>
+            <w:pPr>
+              <w:widowControl w:val="0"/>
+              <w:jc w:val="both"/>
+              <w:rPr>
+                <w:rFonts w:hint="default" w:ascii="Old English Text MT" w:hAnsi="Old English Text MT" w:cs="Old English Text MT"/>
+                <w:color w:val="FFFFFF" w:themeColor="background1"/>
+                <w:sz w:val="94"/>
+                <w:szCs w:val="94"/>
+                <w:lang w:val="en-PH"/>
+                <w14:textFill>
+                  <w14:solidFill>
+                    <w14:schemeClr w14:val="bg1"/>
+                  </w14:solidFill>
+                </w14:textFill>
+              </w:rPr>
+            </w:pPr>
+          </w:p>
+          <w:p>
+            <w:pPr>
+              <w:widowControl w:val="0"/>
+              <w:jc w:val="both"/>
+              <w:rPr>
+                <w:rFonts w:hint="default" w:ascii="Old English Text MT" w:hAnsi="Old English Text MT" w:cs="Old English Text MT"/>
+                <w:color w:val="FFFFFF" w:themeColor="background1"/>
+                <w:sz w:val="94"/>
+                <w:szCs w:val="94"/>
+                <w:lang w:val="en-PH"/>
+                <w14:textFill>
+                  <w14:solidFill>
+                    <w14:schemeClr w14:val="bg1"/>
+                  </w14:solidFill>
+                </w14:textFill>
+              </w:rPr>
+            </w:pPr>
+          </w:p>
+          <w:p>
+            <w:pPr>
+              <w:widowControl w:val="0"/>
+              <w:jc w:val="both"/>
+              <w:rPr>
+                <w:rFonts w:hint="default" w:ascii="Old English Text MT" w:hAnsi="Old English Text MT" w:cs="Old English Text MT"/>
+                <w:color w:val="FFFFFF" w:themeColor="background1"/>
+                <w:sz w:val="72"/>
+                <w:szCs w:val="72"/>
+                <w:lang w:val="en-PH"/>
+                <w14:textFill>
+                  <w14:solidFill>
+                    <w14:schemeClr w14:val="bg1"/>
+                  </w14:solidFill>
+                </w14:textFill>
+              </w:rPr>
+            </w:pPr>
+          </w:p>
+          <w:p>
+            <w:pPr>
+              <w:widowControl w:val="0"/>
+              <w:ind w:firstLine="360" w:firstLineChars="50"/>
+              <w:jc w:val="both"/>
+              <w:rPr>
+                <w:rFonts w:hint="default" w:ascii="Old English Text MT" w:hAnsi="Old English Text MT" w:cs="Old English Text MT"/>
+                <w:color w:val="FFFFFF" w:themeColor="background1"/>
+                <w:sz w:val="72"/>
+                <w:szCs w:val="72"/>
+                <w:lang w:val="en-PH"/>
+                <w14:textFill>
+                  <w14:solidFill>
+                    <w14:schemeClr w14:val="bg1"/>
+                  </w14:solidFill>
+                </w14:textFill>
+              </w:rPr>
+            </w:pPr>
+          </w:p>
+          <w:p>
+            <w:pPr>
+              <w:widowControl w:val="0"/>
+              <w:ind w:firstLine="470" w:firstLineChars="50"/>
+              <w:jc w:val="both"/>
+              <w:rPr>
+                <w:rFonts w:hint="default"/>
+                <w:vertAlign w:val="baseline"/>
+                <w:lang w:val="en-US"/>
+              </w:rPr>
+            </w:pPr>
+            <w:r>
+              <w:rPr>
+                <w:rFonts w:hint="default" w:ascii="Old English Text MT" w:hAnsi="Old English Text MT" w:cs="Old English Text MT"/>
+                <w:color w:val="FFFFFF" w:themeColor="background1"/>
+                <w:sz w:val="94"/>
+                <w:szCs w:val="94"/>
+                <w:lang w:val="en-PH"/>
+                <w14:textFill>
+                  <w14:solidFill>
+                    <w14:schemeClr w14:val="bg1"/>
+                  </w14:solidFill>
+                </w14:textFill>
+              </w:rPr>
+              <w:t>{{person.name}}</w:t>
+            </w:r>
+          </w:p>
+        </w:tc>
+      </w:tr>
+      <w:tr>
+        <w:tblPrEx>
+          <w:tblBorders>
+            <w:top w:val="none" w:color="auto" w:sz="0" w:space="0"/>
+            <w:left w:val="none" w:color="auto" w:sz="0" w:space="0"/>
+            <w:bottom w:val="none" w:color="auto" w:sz="0" w:space="0"/>
+            <w:right w:val="none" w:color="auto" w:sz="0" w:space="0"/>
+            <w:insideH w:val="none" w:color="auto" w:sz="0" w:space="0"/>
+            <w:insideV w:val="none" w:color="auto" w:sz="0" w:space="0"/>
+          </w:tblBorders>
+          <w:tblCellMar>
+            <w:top w:w="0" w:type="dxa"/>
+            <w:left w:w="108" w:type="dxa"/>
+            <w:bottom w:w="0" w:type="dxa"/>
+            <w:right w:w="108" w:type="dxa"/>
+          </w:tblCellMar>
+        </w:tblPrEx>
+        <w:tc>
+          <w:tcPr>
+            <w:tcW w:w="12428" w:type="dxa"/>
+            <w:gridSpan w:val="2"/>
+          </w:tcPr>
+          <w:p>
+            <w:pPr>
+              <w:pStyle w:val="6"/>
+              <w:keepNext w:val="0"/>
+              <w:keepLines w:val="0"/>
+              <w:widowControl/>
+              <w:suppressLineNumbers w:val="0"/>
+              <w:spacing w:line="14" w:lineRule="atLeast"/>
+              <w:jc w:val="left"/>
+              <w:rPr>
+                <w:rFonts w:hint="default" w:ascii="Arial Narrow" w:hAnsi="Arial Narrow" w:cs="Arial Narrow"/>
+                <w:sz w:val="24"/>
+                <w:szCs w:val="24"/>
+                <w:lang w:val="en-PH"/>
+              </w:rPr>
+            </w:pPr>
+          </w:p>
+          <w:p>
+            <w:pPr>
+              <w:pStyle w:val="6"/>
+              <w:keepNext w:val="0"/>
+              <w:keepLines w:val="0"/>
+              <w:widowControl/>
+              <w:suppressLineNumbers w:val="0"/>
+              <w:spacing w:line="14" w:lineRule="atLeast"/>
+              <w:jc w:val="center"/>
+              <w:rPr>
+                <w:rFonts w:hint="default" w:ascii="Arial Narrow" w:hAnsi="Arial Narrow" w:cs="Arial Narrow"/>
+                <w:sz w:val="32"/>
+                <w:szCs w:val="32"/>
+                <w:lang w:val="en-PH"/>
+              </w:rPr>
+            </w:pPr>
+            <w:r>
+              <w:rPr>
+                <w:rFonts w:hint="default" w:ascii="Arial Narrow" w:hAnsi="Arial Narrow" w:cs="Arial Narrow"/>
+                <w:sz w:val="32"/>
+                <w:szCs w:val="32"/>
+                <w:lang w:val="en-PH"/>
+              </w:rPr>
+              <w:t>This certificate is awarded to Mr. {{person.name}} for his remarkable performance for</w:t>
+            </w:r>
+          </w:p>
+          <w:p>
+            <w:pPr>
+              <w:pStyle w:val="6"/>
+              <w:keepNext w:val="0"/>
+              <w:keepLines w:val="0"/>
+              <w:widowControl/>
+              <w:suppressLineNumbers w:val="0"/>
+              <w:spacing w:line="14" w:lineRule="atLeast"/>
+              <w:jc w:val="center"/>
+              <w:rPr>
+                <w:rFonts w:hint="default"/>
+                <w:vertAlign w:val="baseline"/>
+                <w:lang w:val="en-PH"/>
+              </w:rPr>
+            </w:pPr>
+            <w:r>
+              <w:rPr>
+                <w:rFonts w:hint="default" w:ascii="Arial Narrow" w:hAnsi="Arial Narrow" w:cs="Arial Narrow"/>
+                <w:sz w:val="32"/>
+                <w:szCs w:val="32"/>
+                <w:lang w:val="en-PH"/>
+              </w:rPr>
+              <w:t>Sangguniang Kabataan basketball team</w:t>
+            </w:r>
+          </w:p>
+        </w:tc>
+        <w:tc>
+          <w:tcPr>
+            <w:tcW w:w="3186" w:type="dxa"/>
+          </w:tcPr>
+          <w:p>
+            <w:pPr>
+              <w:widowControl w:val="0"/>
+              <w:jc w:val="both"/>
+              <w:rPr>
+                <w:rFonts w:hint="default"/>
+                <w:vertAlign w:val="baseline"/>
+                <w:lang w:val="en-US"/>
+              </w:rPr>
+            </w:pPr>
+          </w:p>
+        </w:tc>
+      </w:tr>
+      <w:tr>
+        <w:tblPrEx>
+          <w:tblBorders>
+            <w:top w:val="none" w:color="auto" w:sz="0" w:space="0"/>
+            <w:left w:val="none" w:color="auto" w:sz="0" w:space="0"/>
+            <w:bottom w:val="none" w:color="auto" w:sz="0" w:space="0"/>
+            <w:right w:val="none" w:color="auto" w:sz="0" w:space="0"/>
+            <w:insideH w:val="none" w:color="auto" w:sz="0" w:space="0"/>
+            <w:insideV w:val="none" w:color="auto" w:sz="0" w:space="0"/>
+          </w:tblBorders>
+          <w:tblCellMar>
+            <w:top w:w="0" w:type="dxa"/>
+            <w:left w:w="108" w:type="dxa"/>
+            <w:bottom w:w="0" w:type="dxa"/>
+            <w:right w:w="108" w:type="dxa"/>
+          </w:tblCellMar>
+        </w:tblPrEx>
+        <w:tc>
+          <w:tcPr>
+            <w:tcW w:w="7662" w:type="dxa"/>
+          </w:tcPr>
+          <w:p>
+            <w:pPr>
+              <w:widowControl w:val="0"/>
+              <w:jc w:val="both"/>
+              <w:rPr>
+                <w:rFonts w:hint="default" w:ascii="Arial Narrow" w:hAnsi="Arial Narrow" w:cs="Arial Narrow"/>
+                <w:sz w:val="36"/>
+                <w:szCs w:val="36"/>
+                <w:lang w:val="en-PH"/>
+              </w:rPr>
+            </w:pPr>
+          </w:p>
+          <w:p>
+            <w:pPr>
+              <w:widowControl w:val="0"/>
+              <w:jc w:val="both"/>
+              <w:rPr>
+                <w:rFonts w:hint="default" w:ascii="Arial Narrow" w:hAnsi="Arial Narrow" w:cs="Arial Narrow"/>
+                <w:sz w:val="36"/>
+                <w:szCs w:val="36"/>
+                <w:lang w:val="en-PH"/>
+              </w:rPr>
+            </w:pPr>
+          </w:p>
+          <w:p>
+            <w:pPr>
+              <w:widowControl w:val="0"/>
+              <w:jc w:val="both"/>
+              <w:rPr>
+                <w:rFonts w:hint="default" w:ascii="Arial Narrow" w:hAnsi="Arial Narrow" w:cs="Arial Narrow"/>
+                <w:sz w:val="32"/>
+                <w:szCs w:val="32"/>
+                <w:lang w:val="en-PH"/>
+              </w:rPr>
+            </w:pPr>
+          </w:p>
+          <w:p>
+            <w:pPr>
+              <w:widowControl w:val="0"/>
+              <w:ind w:firstLine="1620" w:firstLineChars="450"/>
+              <w:jc w:val="both"/>
+              <w:rPr>
+                <w:rFonts w:hint="default"/>
+                <w:vertAlign w:val="baseline"/>
+                <w:lang w:val="en-US"/>
+              </w:rPr>
+            </w:pPr>
+            <w:r>
+              <w:rPr>
+                <w:rFonts w:hint="default" w:ascii="Arial Narrow" w:hAnsi="Arial Narrow" w:cs="Arial Narrow"/>
+                <w:sz w:val="36"/>
+                <w:szCs w:val="36"/>
+                <w:lang w:val="en-PH"/>
+              </w:rPr>
+              <w:t>{{person.director}}</w:t>
+            </w:r>
+            <w:r>
+              <w:rPr>
+                <w:rFonts w:hint="default" w:ascii="Arial Narrow" w:hAnsi="Arial Narrow" w:cs="Arial Narrow"/>
+                <w:sz w:val="36"/>
+                <w:szCs w:val="36"/>
+                <w:lang w:val="en-US"/>
+              </w:rPr>
+              <w:tab/>
+            </w:r>
+            <w:r>
+              <w:rPr>
+                <w:rFonts w:hint="default" w:ascii="Arial Narrow" w:hAnsi="Arial Narrow" w:cs="Arial Narrow"/>
+                <w:sz w:val="36"/>
+                <w:szCs w:val="36"/>
+                <w:lang w:val="en-US"/>
+              </w:rPr>
+              <w:tab/>
+            </w:r>
+            <w:r>
+              <w:rPr>
+                <w:rFonts w:hint="default" w:ascii="Arial Narrow" w:hAnsi="Arial Narrow" w:cs="Arial Narrow"/>
+                <w:sz w:val="36"/>
+                <w:szCs w:val="36"/>
+                <w:lang w:val="en-US"/>
+              </w:rPr>
+              <w:tab/>
+            </w:r>
+            <w:r>
+              <w:rPr>
+                <w:rFonts w:hint="default" w:ascii="Arial Narrow" w:hAnsi="Arial Narrow" w:cs="Arial Narrow"/>
+                <w:sz w:val="36"/>
+                <w:szCs w:val="36"/>
+                <w:lang w:val="en-US"/>
+              </w:rPr>
+              <w:tab/>
+            </w:r>
+            <w:r>
+              <w:rPr>
+                <w:rFonts w:hint="default" w:ascii="Arial Narrow" w:hAnsi="Arial Narrow" w:cs="Arial Narrow"/>
+                <w:sz w:val="36"/>
+                <w:szCs w:val="36"/>
+                <w:lang w:val="en-US"/>
+              </w:rPr>
+              <w:tab/>
+            </w:r>
+            <w:r>
+              <w:rPr>
+                <w:rFonts w:hint="default" w:ascii="Arial Narrow" w:hAnsi="Arial Narrow" w:cs="Arial Narrow"/>
+                <w:sz w:val="36"/>
+                <w:szCs w:val="36"/>
+                <w:lang w:val="en-US"/>
+              </w:rPr>
+              <w:t xml:space="preserve">    </w:t>
+            </w:r>
+          </w:p>
+        </w:tc>
+        <w:tc>
+          <w:tcPr>
+            <w:tcW w:w="7952" w:type="dxa"/>
+            <w:gridSpan w:val="2"/>
+          </w:tcPr>
+          <w:p>
+            <w:pPr>
+              <w:widowControl w:val="0"/>
+              <w:jc w:val="both"/>
+              <w:rPr>
+                <w:rFonts w:hint="default" w:ascii="Arial Narrow" w:hAnsi="Arial Narrow" w:cs="Arial Narrow"/>
+                <w:sz w:val="36"/>
+                <w:szCs w:val="36"/>
+                <w:lang w:val="en-PH"/>
+              </w:rPr>
+            </w:pPr>
+          </w:p>
+          <w:p>
+            <w:pPr>
+              <w:widowControl w:val="0"/>
+              <w:jc w:val="both"/>
+              <w:rPr>
+                <w:rFonts w:hint="default" w:ascii="Arial Narrow" w:hAnsi="Arial Narrow" w:cs="Arial Narrow"/>
+                <w:sz w:val="36"/>
+                <w:szCs w:val="36"/>
+                <w:lang w:val="en-PH"/>
+              </w:rPr>
+            </w:pPr>
+          </w:p>
+          <w:p>
+            <w:pPr>
+              <w:widowControl w:val="0"/>
+              <w:jc w:val="both"/>
+              <w:rPr>
+                <w:rFonts w:hint="default" w:ascii="Arial Narrow" w:hAnsi="Arial Narrow" w:cs="Arial Narrow"/>
+                <w:sz w:val="32"/>
+                <w:szCs w:val="32"/>
+                <w:lang w:val="en-PH"/>
+              </w:rPr>
+            </w:pPr>
+          </w:p>
+          <w:p>
+            <w:pPr>
+              <w:widowControl w:val="0"/>
+              <w:jc w:val="both"/>
+              <w:rPr>
+                <w:rFonts w:hint="default"/>
+                <w:vertAlign w:val="baseline"/>
+                <w:lang w:val="en-US"/>
+              </w:rPr>
+            </w:pPr>
+            <w:r>
+              <w:rPr>
+                <w:rFonts w:hint="default" w:ascii="Arial Narrow" w:hAnsi="Arial Narrow" w:cs="Arial Narrow"/>
+                <w:sz w:val="36"/>
+                <w:szCs w:val="36"/>
+                <w:lang w:val="en-PH"/>
+              </w:rPr>
+              <w:t xml:space="preserve">{{person.coach}} </w:t>
+            </w:r>
+          </w:p>
+        </w:tc>
+      </w:tr>
+    </w:tbl>
     <w:p>
       <w:pPr>
         <w:rPr>
@@ -393,11 +494,30 @@
           <w:szCs w:val="24"/>
           <w:lang w:val="en-PH"/>
         </w:rPr>
+        <w:br w:type="page"/>
+      </w:r>
+    </w:p>
+    <w:p>
+      <w:pPr>
+        <w:widowControl w:val="0"/>
+        <w:jc w:val="both"/>
+        <w:rPr>
+          <w:rFonts w:hint="default"/>
+          <w:lang w:val="en-US"/>
+        </w:rPr>
+      </w:pPr>
+      <w:r>
+        <w:rPr>
+          <w:rFonts w:hint="default" w:ascii="Arial Narrow" w:hAnsi="Arial Narrow" w:cs="Arial Narrow"/>
+          <w:sz w:val="24"/>
+          <w:szCs w:val="24"/>
+          <w:lang w:val="en-PH"/>
+        </w:rPr>
         <w:t>{% endfor</w:t>
       </w:r>
       <w:r>
         <w:rPr>
-          <w:rFonts w:hint="default" w:ascii="Times New Roman" w:hAnsi="Times New Roman" w:cs="Times New Roman"/>
+          <w:rFonts w:hint="default" w:ascii="Arial Narrow" w:hAnsi="Arial Narrow" w:cs="Arial Narrow"/>
           <w:sz w:val="24"/>
           <w:szCs w:val="24"/>
           <w:lang w:val="en-US"/>
@@ -406,43 +526,13 @@
       </w:r>
       <w:r>
         <w:rPr>
-          <w:rFonts w:hint="default" w:ascii="Times New Roman" w:hAnsi="Times New Roman" w:cs="Times New Roman"/>
+          <w:rFonts w:hint="default" w:ascii="Arial Narrow" w:hAnsi="Arial Narrow" w:cs="Arial Narrow"/>
           <w:sz w:val="24"/>
           <w:szCs w:val="24"/>
           <w:lang w:val="en-PH"/>
         </w:rPr>
         <w:t>%}</w:t>
       </w:r>
-    </w:p>
-    <w:p>
-      <w:pPr>
-        <w:pStyle w:val="6"/>
-        <w:keepNext w:val="0"/>
-        <w:keepLines w:val="0"/>
-        <w:widowControl/>
-        <w:suppressLineNumbers w:val="0"/>
-        <w:spacing w:line="14" w:lineRule="atLeast"/>
-        <w:jc w:val="left"/>
-        <w:rPr>
-          <w:rFonts w:hint="default"/>
-          <w:lang w:val="en-PH"/>
-        </w:rPr>
-      </w:pPr>
-    </w:p>
-    <w:p>
-      <w:pPr>
-        <w:pStyle w:val="6"/>
-        <w:keepNext w:val="0"/>
-        <w:keepLines w:val="0"/>
-        <w:widowControl/>
-        <w:suppressLineNumbers w:val="0"/>
-        <w:spacing w:line="14" w:lineRule="atLeast"/>
-        <w:jc w:val="left"/>
-        <w:rPr>
-          <w:rFonts w:hint="default"/>
-          <w:lang w:val="en-US"/>
-        </w:rPr>
-      </w:pPr>
     </w:p>
     <w:sectPr>
       <w:headerReference r:id="rId3" w:type="default"/>

</xml_diff>